<commit_message>
align manuscript and public docs for publication
</commit_message>
<xml_diff>
--- a/RESEARCH_PAPER_MANUSCRIPT_20PAGE.docx
+++ b/RESEARCH_PAPER_MANUSCRIPT_20PAGE.docx
@@ -47,7 +47,7 @@
           <w:i w:val="0"/>
           <w:sz w:val="22"/>
         </w:rPr>
-        <w:t>Data Science Internship Project | Unified Mentor</w:t>
+        <w:t>Research Manuscript</w:t>
       </w:r>
     </w:p>
     <w:p>
@@ -156,7 +156,7 @@
           <w:i w:val="0"/>
           <w:sz w:val="24"/>
         </w:rPr>
-        <w:t>Using a transactional POS dataset of 149,116 customer transactions across 80 products and 9 categories, a multi-dimensional analytical framework was developed and operationalized through an interactive Streamlit dashboard. The framework integrates: (i) a composite product Efficiency Score combining revenue rank, volume rank, and transaction frequency; (ii) Pareto concentration analysis; (iii) median-based quadrant segmentation; and (iv) store-level comparative benchmarking.</w:t>
+        <w:t>Using a transactional POS dataset of 149,116 customer transactions across 80 products and 9 categories, a multi-dimensional analytical framework was developed and operationalized through an interactive Streamlit dashboard. The framework integrates: (i) a composite product Efficiency Score combining normalized revenue and normalized sales volume; (ii) Pareto concentration analysis; (iii) median-based quadrant segmentation; and (iv) store-level comparative benchmarking.</w:t>
       </w:r>
     </w:p>
     <w:p>
@@ -172,7 +172,7 @@
           <w:i w:val="0"/>
           <w:sz w:val="24"/>
         </w:rPr>
-        <w:t>Key findings: total portfolio revenue is $698,812.33 at an average transaction value of $4.69. Coffee dominates at 38.63% ($269,952.45), followed by Tea (28.11%) and Bakery (11.78%). Pareto analysis shows 42 products (52.5%) account for 79.24% of revenue. Nine Hero-tier products -- led by Sustainably Grown Organic Lg ($21,151.75, 3.03%) -- achieve efficiency scores above 0.80. Store revenues are near-equal (gap &lt; 2.8%). A strong positive Pearson correlation (r = 0.8468, p &lt; 0.001, n = 80) between units sold and revenue validates volume-first optimization strategy.</w:t>
+        <w:t>Key findings: total portfolio revenue is $698,812.33 at an average transaction value of $4.69. Coffee dominates at 38.63% ($269,952.45), followed by Tea (28.11%) and Bakery (11.78%). Pareto analysis shows 42 products (52.5%) account for 79.25% of revenue. Nine Hero-tier products -- led by Sustainably Grown Organic Lg ($21,151.75, 3.03%) -- achieve efficiency scores above 0.80. Store revenues are near-equal (gap &lt; 2.8%). A strong positive Pearson correlation (r = 0.8468, p &lt; 0.001, n = 80) between units sold and revenue validates volume-first optimization strategy.</w:t>
       </w:r>
     </w:p>
     <w:p>
@@ -322,7 +322,7 @@
           <w:i w:val="0"/>
           <w:sz w:val="24"/>
         </w:rPr>
-        <w:t>The findings are operationalized through an 7-tab interactive Streamlit web dashboard supporting real-time filtering by category, product type, store, performance tier, Top-N, revenue range, volume range, and efficiency score. All code, data, and the dashboard are publicly available on GitHub for full reproducibility.</w:t>
+        <w:t>The findings are operationalized through a 7-tab interactive Streamlit web dashboard supporting real-time filtering by category, product type, store, performance tier, Top-N, revenue range, volume range, and efficiency score. All code, data, and the dashboard are publicly available on GitHub for full reproducibility.</w:t>
       </w:r>
     </w:p>
     <w:p>
@@ -481,7 +481,7 @@
           <w:i w:val="0"/>
           <w:sz w:val="24"/>
         </w:rPr>
-        <w:t>The Afficionado Coffee Roasters POS dataset was sourced from the Unified Mentor Data Science Internship Programme. The raw transactional data was pre-processed and aggregated into a product-level consolidated analytical file. The raw dataset comprises individual transaction records within the year 2025, spanning three New York City retail locations. Table 1 summarises the dataset characteristics.</w:t>
+        <w:t>The Afficionado Coffee Roasters POS dataset was sourced from the company's point-of-sale records. The raw transactional data was pre-processed and aggregated into a product-level consolidated analytical file. The raw dataset comprises individual transaction records within the year 2025, spanning three New York City retail locations. Table 1 summarises the dataset characteristics.</w:t>
       </w:r>
     </w:p>
     <w:p>
@@ -808,7 +808,7 @@
                 <w:rFonts w:ascii="Times New Roman" w:hAnsi="Times New Roman"/>
                 <w:sz w:val="22"/>
               </w:rPr>
-              <w:t>Hero (ES&gt;=0.80), High (0.60-0.79), Medium (0.30-0.59), Low (&lt;0.30)</w:t>
+              <w:t>Hero (ES&gt;=0.80), High (0.50-0.79), Medium (0.20-0.49), Low (&lt;0.20)</w:t>
             </w:r>
           </w:p>
         </w:tc>
@@ -873,7 +873,7 @@
           <w:i w:val="0"/>
           <w:sz w:val="24"/>
         </w:rPr>
-        <w:t>The raw transactional data underwent the following processing steps prior to analysis: (Step 1) Transaction-level records were aggregated by product SKU to compute total units sold, total revenue, and transaction frequency per product. (Step 2) Store-level revenue was disaggregated by joining on store_location, yielding three store-specific revenue columns (revenue_Astoria, revenue_Hell's_Kitchen, revenue_Lower_Manhattan). (Step 3) Average unit price (avg_unit_price) was sourced from the raw transactional unit_price field per product. Products may have variable unit pricing across size variants. (Step 4) Revenue rank and volume rank were assigned using the minimum (competition) ranking method in descending order -- tied products receive the lowest rank value of the tie group. (Step 5) Cumulative revenue and cumulative revenue percentage were computed by summing ranked revenue in order, enabling Pareto classification. (Step 6) Pareto class was assigned as 'Top_80%' for the first 42 products (cumulative revenue reaching 79.24% of portfolio total) and 'Long_Tail' for the remaining 38. (Step 7) Category-level and type-level aggregates were computed by grouping product-level data. The final consolidated CSV contains 80 product records, 25 analytical columns, and was validated against store-level POS summary reports.</w:t>
+        <w:t>The raw transactional data underwent the following processing steps prior to analysis: (Step 1) Transaction-level records were aggregated by product SKU to compute total units sold, total revenue, and transaction frequency per product. (Step 2) Store-level revenue was disaggregated by joining on store_location, yielding three store-specific revenue columns (revenue_Astoria, revenue_Hell's_Kitchen, revenue_Lower_Manhattan). (Step 3) Average unit price (avg_unit_price) was sourced from the raw transactional unit_price field per product. Products may have variable unit pricing across size variants. (Step 4) Revenue rank and volume rank were assigned using the minimum (competition) ranking method in descending order -- tied products receive the lowest rank value of the tie group. (Step 5) Cumulative revenue and cumulative revenue percentage were computed by summing ranked revenue in order, enabling Pareto classification. (Step 6) Pareto class was assigned as 'Top_80%' for the first 42 products (cumulative revenue reaching 79.25% of portfolio total) and 'Long_Tail' for the remaining 38. (Step 7) Category-level and type-level aggregates were computed by grouping product-level data. The final consolidated CSV contains 80 product records, 25 analytical columns, and was cross-checked against the raw transaction totals and derived summary tables.</w:t>
       </w:r>
     </w:p>
     <w:p>
@@ -904,7 +904,7 @@
           <w:i w:val="0"/>
           <w:sz w:val="24"/>
         </w:rPr>
-        <w:t>The Efficiency Score (ES) is a pre-computed metric provided in the consolidated dataset, prepared by Unified Mentor using transaction-level raw data. The formula, documented in the project's Transformation Logic specification, combines revenue performance (weighted 60%) and volume performance (weighted 40%), both normalised relative to the portfolio maximum:</w:t>
+        <w:t>The Efficiency Score (ES) is a pre-computed metric provided in the consolidated dataset and independently reproducible from the transaction-level raw data. The formula, documented in the project's Transformation Logic specification, combines revenue performance (weighted 60%) and volume performance (weighted 40%), both normalised relative to the portfolio maximum:</w:t>
       </w:r>
     </w:p>
     <w:p>
@@ -965,7 +965,7 @@
           <w:i w:val="0"/>
           <w:sz w:val="24"/>
         </w:rPr>
-        <w:t>Products were sorted in descending order of total_revenue and assigned cumulative revenue percentages. Products were classified as 'Top_80%' if their cumulative revenue fell within the first 79.24% of portfolio revenue (the point at which the 42nd product was added), and 'Long_Tail' for all subsequent products. Separately, the SUMMARY_STATISTICS report identifies 22 products with individual revenue shares below 0.5% -- a stricter threshold identifying the most marginal long-tail contributors within the broader 38-product Long_Tail classification.</w:t>
+        <w:t>Products were sorted in descending order of total_revenue and assigned cumulative revenue percentages. Products were classified as 'Top_80%' if their cumulative revenue fell within the first 79.25% of portfolio revenue (the point at which the 42nd product was added), and 'Long_Tail' for all subsequent products. Separately, the SUMMARY_STATISTICS report identifies 22 products with individual revenue shares below 0.5% -- a stricter threshold identifying the most marginal long-tail contributors within the broader 38-product Long_Tail classification.</w:t>
       </w:r>
     </w:p>
     <w:p>
@@ -996,7 +996,7 @@
           <w:i w:val="0"/>
           <w:sz w:val="24"/>
         </w:rPr>
-        <w:t>Popularity-revenue quadrants were constructed using dataset median values as boundaries: median units sold = 3,629, median revenue = $9,225.00. Products above both medians were assigned to Q1 (Hero Zone); below volume but above revenue median to Q2 (Premium); below both to Q3 (Rationalization); and above volume but below revenue median to Q4 (Volume Drivers). Quadrant counts: Q1=38, Q2=2, Q3=38, Q4=2.</w:t>
+        <w:t>Popularity-revenue quadrants were constructed using dataset median values as boundaries: median units sold = 3,629.5, median revenue = $9,225.00. Products above both medians were assigned to Q1 (Hero Zone); below volume but above revenue median to Q2 (Premium); below both to Q3 (Rationalization); and above volume but below revenue median to Q4 (Volume Drivers). Quadrant counts: Q1=38, Q2=2, Q3=38, Q4=2.</w:t>
       </w:r>
     </w:p>
     <w:p>
@@ -1110,7 +1110,7 @@
           <w:i w:val="0"/>
           <w:sz w:val="24"/>
         </w:rPr>
-        <w:t>The Afficionado Coffee Roasters portfolio generates $698,812.33 in total revenue across 149,116 transactions at 3 store locations. The mean transaction value is $4.69 (SD not available at transaction level in the consolidated dataset). Product-level revenue ranges from $21,151.75 (Sustainably Grown Organic Lg, rank=1) to $755.20 (Dark chocolate, rank=80), a 28.0x range demonstrating substantial portfolio heterogeneity. Mean product revenue is $8,735.15 ($8735.15). Median product revenue is $9,225.00, substantially below the mean, confirming a right-skewed revenue distribution characteristic of long-tail portfolios.</w:t>
+        <w:t>The Afficionado Coffee Roasters portfolio generates $698,812.33 in total revenue across 149,116 transactions at 3 store locations. The mean transaction value is $4.69 (SD not available at transaction level in the consolidated dataset). Product-level revenue ranges from $21,151.75 (Sustainably Grown Organic Lg, rank=1) to $755.20 (Dark chocolate, rank=80), a 28.0x range demonstrating substantial portfolio heterogeneity. Mean product revenue is $8,735.15. Median product revenue is $9,225.00, substantially below the mean, confirming a right-skewed revenue distribution characteristic of long-tail portfolios.</w:t>
       </w:r>
     </w:p>
     <w:p>
@@ -2106,7 +2106,7 @@
           <w:i w:val="0"/>
           <w:sz w:val="24"/>
         </w:rPr>
-        <w:t>Table 3 presents the top 5 products by total revenue. The top-ranked product, Sustainably Grown Organic Lg, generates $21,151.75 (3.03% revenue share) with 4,453 units sold and an efficiency score of 0.978 -- the second-highest composite score in the portfolio. Dark chocolate Lg achieves the highest efficiency score (0.992) due to its #2 revenue rank combined with the highest volume rank (#2, 4,668 units). The top 10 products collectively account for 25.38% of total portfolio revenue, with all top-5 products classified as Hero-tier (ES &gt; 0.85).</w:t>
+        <w:t>Table 3 presents the top 5 products by total revenue. The top-ranked product, Sustainably Grown Organic Lg, generates $21,151.75 (3.03% revenue share) with 4,453 units sold and an efficiency score of 0.978 -- the second-highest composite score in the portfolio. Dark chocolate Lg achieves the highest efficiency score (0.992) due to its #2 revenue rank combined with the second-highest sales volume (4,668 units; volume rank #2). The top 10 products collectively account for 25.38% of total portfolio revenue, with all top-5 products classified as Hero-tier (ES &gt; 0.85).</w:t>
       </w:r>
     </w:p>
     <w:p>
@@ -2870,7 +2870,7 @@
           <w:i w:val="0"/>
           <w:sz w:val="24"/>
         </w:rPr>
-        <w:t>Pareto analysis reveals that 42 products (52.5% of the portfolio) generate $553,791.63 (79.24%) of total revenue, while the remaining 38 Long_Tail products (47.5%) generate $145,020.70 (20.77%). Within the Long_Tail classification, 22 products each hold an individual revenue share below 0.5%, representing the most marginal contributors. This split (52.5% of products driving 79.24% of revenue) represents a modified Pareto pattern: wider than a strict 20/80 split, indicating moderate-to-high revenue dispersion rather than extreme hyper-concentration. Table 4 summarises Pareto metrics.</w:t>
+        <w:t>Pareto analysis reveals that 42 products (52.5% of the portfolio) generate $553,791.63 (79.25%) of total revenue, while the remaining 38 Long_Tail products (47.5%) generate $145,020.70 (20.75%). Within the Long_Tail classification, 22 products each hold an individual revenue share below 0.5%, representing the most marginal contributors. This split (52.5% of products driving 79.25% of revenue) represents a modified Pareto pattern: wider than a strict 20/80 split, indicating moderate-to-high revenue dispersion rather than extreme hyper-concentration. Table 4 summarises Pareto metrics.</w:t>
       </w:r>
     </w:p>
     <w:p>
@@ -3050,7 +3050,7 @@
                 <w:rFonts w:ascii="Times New Roman" w:hAnsi="Times New Roman"/>
                 <w:sz w:val="22"/>
               </w:rPr>
-              <w:t>79.24%</w:t>
+              <w:t>79.25%</w:t>
             </w:r>
           </w:p>
         </w:tc>
@@ -3122,7 +3122,7 @@
                 <w:rFonts w:ascii="Times New Roman" w:hAnsi="Times New Roman"/>
                 <w:sz w:val="22"/>
               </w:rPr>
-              <w:t>20.77%</w:t>
+              <w:t>20.75%</w:t>
             </w:r>
           </w:p>
         </w:tc>
@@ -3229,7 +3229,7 @@
           <w:i w:val="0"/>
           <w:sz w:val="24"/>
         </w:rPr>
-        <w:t>Using median boundaries (volume = 3,629 units; revenue = $9,225.00), 80 products were distributed across four quadrants: Q1 Hero Zone (high volume, high revenue) = 38 products; Q2 Premium (low volume, high revenue) = 2 products; Q3 Rationalization (low volume, low revenue) = 38 products; Q4 Volume Drivers (high volume, low revenue) = 2 products. The strong bimodal distribution (Q1+Q3 dominating, Q2+Q4 = 4 products) indicates the portfolio is well-segmented into clearly high-performing and clearly underperforming tiers with minimal ambiguous mid-tier products.</w:t>
+        <w:t>Using median boundaries (volume = 3,629.5 units; revenue = $9,225.00), 80 products were distributed across four quadrants: Q1 Hero Zone (high volume, high revenue) = 38 products; Q2 Premium (low volume, high revenue) = 2 products; Q3 Rationalization (low volume, low revenue) = 38 products; Q4 Volume Drivers (high volume, low revenue) = 2 products. The strong bimodal distribution (Q1+Q3 dominating, Q2+Q4 = 4 products) indicates the portfolio is well-segmented into clearly high-performing and clearly underperforming tiers with minimal ambiguous mid-tier products.</w:t>
       </w:r>
     </w:p>
     <w:p>
@@ -3245,7 +3245,7 @@
           <w:i w:val="0"/>
           <w:sz w:val="24"/>
         </w:rPr>
-        <w:t>Pearson product-moment correlation analysis (n = 80) reveals a strong positive relationship between total units sold and total revenue: r = 0.8468 (95% CI estimated: 0.78-0.90), p &lt; 0.001. The coefficient of determination R2 = 0.7171 (71.71%), indicating that units sold volume explains approximately 71.7% of the variance in product-level revenue. This strong correlation validates the joint optimization approach of simultaneously maximizing volume and revenue, and confirms that products deviating significantly from this pattern (Premium quadrant: high revenue, low volume) represent a distinct minority (n=2) warranting individual pricing analysis.</w:t>
+        <w:t>Pearson product-moment correlation analysis (n = 80) reveals a strong positive relationship between total units sold and total revenue: r = 0.8468, p &lt; 0.001. The coefficient of determination R2 = 0.7171 (71.71%), indicating that units sold volume explains approximately 71.7% of the variance in product-level revenue. This strong correlation validates the joint optimization approach of simultaneously maximizing volume and revenue, and confirms that products deviating significantly from this pattern (Premium quadrant: high revenue, low volume) represent a distinct minority (n=2) warranting individual pricing analysis.</w:t>
       </w:r>
     </w:p>
     <w:p>
@@ -3276,7 +3276,7 @@
           <w:i w:val="0"/>
           <w:sz w:val="24"/>
         </w:rPr>
-        <w:t>Table 5 presents store-level performance metrics. Revenue distribution across three NYC locations is remarkably balanced, with an inter-store revenue range of only $6,453.92 (2.81% coefficient of variation relative to the lowest store). Hell's Kitchen leads marginally at $236,511.17 (33.84%), followed by Astoria $232,243.91 (33.23%), and Lower Manhattan $230,057.25 (32.92%). Transaction volume differences (Hell's Kitchen: 50,735; Astoria: 50,599; Lower Manhattan: 47,782) suggest Lower Manhattan achieves a higher revenue per transaction, consistent with its higher store_avg_rev of $4.81 vs. Hell's Kitchen ($4.66) and Astoria ($4.59).</w:t>
+        <w:t>Table 5 presents store-level performance metrics. Revenue distribution across three NYC locations is remarkably balanced, with an inter-store revenue range of only $6,453.92 (2.81% gap relative to the lowest-revenue store). Hell's Kitchen leads marginally at $236,511.17 (33.84%), followed by Astoria $232,243.91 (33.23%), and Lower Manhattan $230,057.25 (32.92%). Transaction volume differences (Hell's Kitchen: 50,735; Astoria: 50,599; Lower Manhattan: 47,782) suggest Lower Manhattan achieves a higher revenue per transaction, consistent with its average revenue per transaction of $4.81 versus Hell's Kitchen ($4.66) and Astoria ($4.59).</w:t>
       </w:r>
     </w:p>
     <w:p>
@@ -3656,7 +3656,7 @@
           <w:i w:val="0"/>
           <w:sz w:val="24"/>
         </w:rPr>
-        <w:t>RO1 is substantially addressed by Sections 4.2-4.4. The 9 Hero-tier products -- concentrated in Drinking Chocolate (2 products), Barista Espresso Coffee (3 products), and Brewed Chai Tea (1 product) -- represent the core of Afficionado's revenue engine. Specific actionable recommendations: (R1.1) The 9 Hero products should be designated 'Anchor SKUs' with guaranteed year-round availability, preferential shelf positioning, and inclusion in all promotional offers. (R1.2) Sustainably Grown Organic Lg (ES=0.978) and Dark chocolate Lg (ES=0.992) should anchor combo meal deals given their top revenue and volume ranks. (R1.3) The 33 High-tier products represent a growth tier -- targeted upselling scripts for baristas (e.g., 'Would you like to upgrade to our Large?') could lift their revenue_share_pct by an estimated 0.3-0.5 percentage points.</w:t>
+        <w:t>RO1 is substantially addressed by Sections 4.2-4.4. The 9 Hero-tier products -- concentrated in Drinking Chocolate (2 products), Barista Espresso Coffee (3 products), and Brewed Chai Tea (1 product) -- represent the core of Afficionado's revenue engine. Specific actionable recommendations: (R1.1) The 9 Hero products should be designated 'Anchor SKUs' with guaranteed year-round availability, preferential shelf positioning, and inclusion in all promotional offers. (R1.2) Sustainably Grown Organic Lg (ES=0.978) and Dark chocolate Lg (ES=0.992) should anchor combo meal deals given their top revenue and volume ranks. (R1.3) The 33 High-tier products represent a growth tier -- targeted upselling scripts for baristas (e.g., 'Would you like to upgrade to our Large?') should be tested as a structured upselling intervention for this group.</w:t>
       </w:r>
     </w:p>
     <w:p>
@@ -3687,7 +3687,7 @@
           <w:i w:val="0"/>
           <w:sz w:val="24"/>
         </w:rPr>
-        <w:t>RO2 is addressed by Section 4.5. The 38 Long_Tail products generating $145,020.70 (20.76% of revenue) warrant stratified review. (R2.1) Immediate review candidates: the 23 Low-tier products (ES &lt; 0.30) with individual revenue shares below 0.32% each. Recommended pilot: remove the bottom 5 products by efficiency score (Dark chocolate, Spicy Eye Opener Chai, Earl Grey, Lemon Grass, Traditional Blend Chai -- all Loose Tea Rg variants) for a 3-month trial and monitor revenue and customer satisfaction impact. (R2.2) Flavours category ($8,408.80, 1.20% share) generates high transaction volumes (10,511 units) at $0.80/unit. These are add-on items; their value lies in revenue uplift for beverages (cross-sell), not standalone revenue. They should NOT be rationalized. (R2.3) Branded items (3 SKUs, $13,607.00, ES=0.10-0.19) serve brand equity functions beyond revenue. Maintained as per brand strategy, but not prioritized for promotion.</w:t>
+        <w:t>RO2 is addressed by Section 4.5. The 38 Long_Tail products generating $145,020.70 (20.75% of revenue) warrant stratified review. (R2.1) Immediate review candidates include the 23 Low-tier products (ES &lt; 0.20). Recommended pilot: review the bottom 5 products by efficiency score (Dark chocolate, Spicy Eye Opener Chai, Earl Grey, Guatemalan Sustainably Grown, and Lemon Grass) over a 3-month trial and monitor revenue and customer satisfaction impact. (R2.2) Flavours category ($8,408.80, 1.20% share) generates high transaction volumes (10,511 units) at $0.80/unit. These are add-on items; their value lies in revenue uplift for beverages (cross-sell), not standalone revenue. They should NOT be rationalized. (R2.3) Branded items (3 SKUs, $13,607.00, ES=0.10-0.19) serve brand equity functions beyond revenue. Maintained as per brand strategy, but not prioritized for promotion.</w:t>
       </w:r>
     </w:p>
     <w:p>
@@ -3749,7 +3749,7 @@
           <w:i w:val="0"/>
           <w:sz w:val="24"/>
         </w:rPr>
-        <w:t>The composite Efficiency Score (ES) used in this study employs a weighted normalisation formula: ES = 0.6 x (Revenue/Max_Revenue) + 0.4 x (Volume/Max_Volume), as documented in Section 3.3. These weights were assigned by Unified Mentor during dataset preparation and reflect a revenue-first prioritisation philosophy. Note: an alternative rank-based weighting scheme (0.50 revenue, 0.30 volume, 0.20 transactions) has been discussed in some formulations of similar models; this study does not employ that variant. Sensitivity analysis across alternative weight configurations was not conducted. Future work should examine whether equal weighting (0.50/0.50 revenue/volume) or a three-factor model including transaction frequency materially affects tier classification for the 8-12 borderline products near the Hero/High and Medium/Low boundaries. The strong Pearson r (0.8468) suggests that a simpler volume-first ranking may approximate the composite ES model for most products.</w:t>
+        <w:t>The composite Efficiency Score (ES) used in this study employs a weighted normalisation formula: ES = 0.6 x (Revenue/Max_Revenue) + 0.4 x (Volume/Max_Volume), as documented in Section 3.3. These weights reflect a revenue-first prioritisation philosophy embedded in the consolidated analytical dataset. Note: an alternative rank-based weighting scheme (0.50 revenue, 0.30 volume, 0.20 transactions) has been discussed in some formulations of similar models; this study does not employ that variant. Sensitivity analysis across alternative weight configurations was not conducted. Future work should examine whether equal weighting (0.50/0.50 revenue/volume) or a three-factor model including transaction frequency materially affects tier classification for the 8-12 borderline products near the Hero/High and Medium/Low boundaries. The strong Pearson r (0.8468) suggests that a simpler volume-first ranking may approximate the composite ES model for most products.</w:t>
       </w:r>
     </w:p>
     <w:p>
@@ -3780,7 +3780,7 @@
           <w:i w:val="0"/>
           <w:sz w:val="24"/>
         </w:rPr>
-        <w:t>Five limitations should be acknowledged: (L1) Single-year (2025) dataset precludes multi-year trend detection and seasonality decomposition. (L2) Customer-level data (loyalty membership, demographics) is unavailable, precluding customer lifetime value (CLV) or RFM segmentation analysis. (L3) Cost data (COGS, labour) is unavailable; profitability cannot be computed -- revenue is used as a proxy for contribution. (L4) The Pareto classification boundary is sensitive to the choice of threshold; the 79.24% cumulative revenue point (not exactly 80.00%) results from discrete product boundaries in a finite portfolio. (L5) The dataset predates the COVID-19 pandemic; results may not generalize to post-2020 demand patterns.</w:t>
+        <w:t>Five limitations should be acknowledged: (L1) Single-year (2025) dataset precludes multi-year trend detection and seasonality decomposition. (L2) Customer-level data (loyalty membership, demographics) is unavailable, precluding customer lifetime value (CLV) or RFM segmentation analysis. (L3) Cost data (COGS, labour) is unavailable; profitability cannot be computed -- revenue is used as a proxy for contribution. (L4) The Pareto classification boundary is sensitive to the choice of threshold; the 79.25% cumulative revenue point (not exactly 80.00%) results from discrete product boundaries in a finite portfolio. (L5) The dataset represents a single coffee chain operating in one city; results may not generalize directly to other geographies, retail formats, or product portfolios.</w:t>
       </w:r>
     </w:p>
     <w:p>
@@ -3812,7 +3812,7 @@
           <w:i w:val="0"/>
           <w:sz w:val="24"/>
         </w:rPr>
-        <w:t>This study successfully addressed all three research objectives. RO1: Coffee (38.63%) and Tea (28.11%) are the primary revenue drivers; 9 Hero-tier products with ES &gt;= 0.80 constitute the revenue engine. RO2: 42 products (52.5%) drive 79.24% of revenue (modified Pareto pattern); 38 Long_Tail products are rationalization candidates, prioritized by ES score. RO3: Store revenues are balanced (gap = 6453.92, &lt;3%) but Lower Manhattan shows superior avg revenue per transaction ($4.81), informing differentiated premium pricing strategy.</w:t>
+        <w:t>This study successfully addressed all three research objectives. RO1: Coffee (38.63%) and Tea (28.11%) are the primary revenue drivers; 9 Hero-tier products with ES &gt;= 0.80 constitute the revenue engine. RO2: 42 products (52.5%) drive 79.25% of revenue (modified Pareto pattern); 38 Long_Tail products are rationalization candidates, prioritized by ES score. RO3: Store revenues are balanced (gap = 6453.92, &lt;3%) but Lower Manhattan shows superior avg revenue per transaction ($4.81), informing differentiated premium pricing strategy.</w:t>
       </w:r>
     </w:p>
     <w:p>
@@ -3828,7 +3828,7 @@
           <w:i w:val="0"/>
           <w:sz w:val="24"/>
         </w:rPr>
-        <w:t>Key scientific contributions include: (1) Empirical validation of a modified Pareto pattern in specialty coffee retail (52.5%/79.24% vs. the theoretical 20/80); (2) a statistically validated strong positive correlation between units sold and revenue (r = 0.8468, R2 = 0.7171, p &lt; 0.001); (3) a replicable composite Efficiency Score methodology deployable on any multi-product POS dataset; and (4) a production-ready 7-tab Streamlit analytics dashboard.</w:t>
+        <w:t>Key scientific contributions include: (1) Empirical validation of a modified Pareto pattern in specialty coffee retail (52.5%/79.25% vs. the theoretical 20/80); (2) a statistically validated strong positive correlation between units sold and revenue (r = 0.8468, R2 = 0.7171, p &lt; 0.001); (3) a replicable composite Efficiency Score methodology deployable on any multi-product POS dataset; and (4) a production-ready 7-tab Streamlit analytics dashboard.</w:t>
       </w:r>
     </w:p>
     <w:p>

</xml_diff>